<commit_message>
feat: first major build
</commit_message>
<xml_diff>
--- a/docs/KO_Design_System.docx
+++ b/docs/KO_Design_System.docx
@@ -1253,7 +1253,7 @@
         <w:rPr>
           <w:rtl w:val="0"/>
         </w:rPr>
-        <w:t xml:space="preserve">Brand font: Bricokage Bold pair with mont regular. </w:t>
+        <w:t xml:space="preserve">Brand font: Bricolage Bold paired with Montserrat Regular. </w:t>
       </w:r>
     </w:p>
     <w:tbl>
@@ -15498,7 +15498,7 @@
               <w:rPr>
                 <w:rtl w:val="0"/>
               </w:rPr>
-              <w:t xml:space="preserve">Brand font: Bricokage Bold pair with mont regular. </w:t>
+              <w:t xml:space="preserve">Brand font: Bricolage Bold paired with Montserrat Regular. </w:t>
             </w:r>
           </w:p>
         </w:tc>

</xml_diff>